<commit_message>
submission Word/PDF rebuilt with aligned wording
Co-Authored-By: Claude Fable 5.1 <noreply@anthropic.com>
</commit_message>
<xml_diff>
--- a/hemonc_feature_submission_20261021.docx
+++ b/hemonc_feature_submission_20261021.docx
@@ -286,15 +286,7 @@
             </w:pPr>
             <w:r>
               <w:rPr/>
-              <w:t>整合血液惡性疾病與實體腫瘤照護</w:t>
-            </w:r>
-            <w:r>
-              <w:rPr/>
-              <w:t>,</w:t>
-            </w:r>
-            <w:r>
-              <w:rPr/>
-              <w:t>以分子檢測與基因分析選擇標靶、免疫與細胞治療</w:t>
+              <w:t>為血液惡性疾病與實體腫瘤病人提供自分子診斷至標靶、免疫與細胞治療的照護</w:t>
             </w:r>
             <w:r>
               <w:rPr/>
@@ -302,7 +294,7 @@
             </w:r>
             <w:r>
               <w:rPr/>
-              <w:t>造血幹細胞移植、</w:t>
+              <w:t xml:space="preserve">以造血幹細胞移植、健保 </w:t>
             </w:r>
             <w:r>
               <w:rPr/>
@@ -310,15 +302,7 @@
             </w:r>
             <w:r>
               <w:rPr/>
-              <w:t xml:space="preserve">與 </w:t>
-            </w:r>
-            <w:r>
-              <w:rPr/>
-              <w:t xml:space="preserve">Phase I </w:t>
-            </w:r>
-            <w:r>
-              <w:rPr/>
-              <w:t>臨床試驗銜接常規治療與創新療法。</w:t>
+              <w:t>與第一期臨床試驗銜接常規治療與創新療法。</w:t>
             </w:r>
           </w:p>
         </w:tc>
@@ -342,7 +326,7 @@
             </w:pPr>
             <w:r>
               <w:rPr/>
-              <w:t xml:space="preserve">69 </w:t>
+              <w:t xml:space="preserve">68 </w:t>
             </w:r>
             <w:r>
               <w:rPr/>
@@ -401,7 +385,15 @@
             </w:pPr>
             <w:r>
               <w:rPr/>
-              <w:t>涵蓋白血病、淋巴瘤、骨髓瘤等血液惡性疾病</w:t>
+              <w:t>為中南部主要造血幹細胞移植中心之一</w:t>
+            </w:r>
+            <w:r>
+              <w:rPr/>
+              <w:t>,</w:t>
+            </w:r>
+            <w:r>
+              <w:rPr/>
+              <w:t>收治白血病、淋巴瘤、骨髓瘤等血液惡性疾病</w:t>
             </w:r>
             <w:r>
               <w:rPr/>
@@ -417,15 +409,7 @@
             </w:r>
             <w:r>
               <w:rPr/>
-              <w:t>依分子與基因檢測個人化治療。為中南部主要造血幹細胞移植中心之一</w:t>
-            </w:r>
-            <w:r>
-              <w:rPr/>
-              <w:t>,</w:t>
-            </w:r>
-            <w:r>
-              <w:rPr/>
-              <w:t>提供半相合、</w:t>
+              <w:t>依分子與基因檢測個人化治療。提供半相合、</w:t>
             </w:r>
             <w:r>
               <w:rPr/>
@@ -437,7 +421,7 @@
             </w:r>
             <w:r>
               <w:rPr/>
-              <w:t>;</w:t>
+              <w:t>,</w:t>
             </w:r>
             <w:r>
               <w:rPr/>
@@ -453,19 +437,11 @@
             </w:r>
             <w:r>
               <w:rPr/>
-              <w:t>CIK;</w:t>
-            </w:r>
-            <w:r>
-              <w:rPr/>
-              <w:t xml:space="preserve">持續引進 </w:t>
-            </w:r>
-            <w:r>
-              <w:rPr/>
-              <w:t xml:space="preserve">Phase I </w:t>
-            </w:r>
-            <w:r>
-              <w:rPr/>
-              <w:t>與國際多中心試驗。治療由多專科團隊會議決策</w:t>
+              <w:t>CIK,</w:t>
+            </w:r>
+            <w:r>
+              <w:rPr/>
+              <w:t>並持續引進第一期與國際多中心試驗。治療決策經多專科團隊會議</w:t>
             </w:r>
             <w:r>
               <w:rPr/>
@@ -505,7 +481,7 @@
             </w:pPr>
             <w:r>
               <w:rPr/>
-              <w:t xml:space="preserve">179 </w:t>
+              <w:t xml:space="preserve">178 </w:t>
             </w:r>
             <w:r>
               <w:rPr/>
@@ -608,15 +584,7 @@
             </w:r>
             <w:r>
               <w:rPr/>
-              <w:t>細胞淋巴瘤</w:t>
-            </w:r>
-            <w:r>
-              <w:rPr/>
-              <w:t>,</w:t>
-            </w:r>
-            <w:r>
-              <w:rPr/>
-              <w:t>並有實際治療成功案例。</w:t>
+              <w:t>細胞淋巴瘤。</w:t>
             </w:r>
             <w:r>
               <w:rPr/>
@@ -1159,17 +1127,121 @@
             </w:pPr>
             <w:r>
               <w:rPr/>
-              <w:t>1. Wang F, Lin CY, Sun JM, et al. Ociperlimab and tislelizumab in advanced esophageal squamous cell carcinoma (AdvanTIG-203): a phase II study. Nat Commun. 2026 Sep 18 (online). DOI 10.1038/s41467-026-77705-8</w:t>
+              <w:t>1. Wang F, Lin CY, Sun JM, et al. Ociperlimab and tislelizumab in advanced esophageal squamous cell carcinoma (AdvanTIG-203): a phase II study. Nat Commun. 2026 Sep 18 (online). DOI 10.1038/s41467-026-77705-8(</w:t>
+            </w:r>
+            <w:r>
+              <w:rPr/>
+              <w:t>本科林振源第二作者</w:t>
+            </w:r>
+            <w:r>
+              <w:rPr/>
+              <w:t>;</w:t>
+            </w:r>
+            <w:r>
+              <w:rPr/>
+              <w:t>國際多中心隨機第二期試驗</w:t>
+            </w:r>
+            <w:r>
+              <w:rPr/>
+              <w:t>)</w:t>
               <w:br/>
-              <w:t>2. Chen TT, et al. Haploidentical peripheral blood stem cell transplantation with ATG plus post-transplant cyclophosphamide as GVHD prophylaxis. Int J Hematol. 2022. DOI 10.1007/s12185-021-03280-x</w:t>
+              <w:t>2. Chen TT, et al. Haploidentical peripheral blood stem cell transplantation with ATG plus post-transplant cyclophosphamide as GVHD prophylaxis. Int J Hematol. 2022. DOI 10.1007/s12185-021-03280-x(</w:t>
+            </w:r>
+            <w:r>
+              <w:rPr/>
+              <w:t>本科陳姿婷第一作者、葉士芃通訊作者</w:t>
+            </w:r>
+            <w:r>
+              <w:rPr/>
+              <w:t>;</w:t>
+            </w:r>
+            <w:r>
+              <w:rPr/>
+              <w:t>移植臨床研究</w:t>
+            </w:r>
+            <w:r>
+              <w:rPr/>
+              <w:t>)</w:t>
               <w:br/>
-              <w:t>3. Cheng FM, et al. Deep learning assists in acute leukemia detection and cell classification via flow cytometry using the acute leukemia orientation tube. Sci Rep. 2024;14:8350. DOI 10.1038/s41598-024-58580-z</w:t>
+              <w:t>3. Cheng FM, et al. Deep learning assists in acute leukemia detection and cell classification via flow cytometry using the acute leukemia orientation tube. Sci Rep. 2024;14:8350. DOI 10.1038/s41598-024-58580-z(</w:t>
+            </w:r>
+            <w:r>
+              <w:rPr/>
+              <w:t>本科鄭富銘第一作者、林精湛合著</w:t>
+            </w:r>
+            <w:r>
+              <w:rPr/>
+              <w:t>;</w:t>
+            </w:r>
+            <w:r>
+              <w:rPr/>
+              <w:t>與本院人工智慧中心合作</w:t>
+            </w:r>
+            <w:r>
+              <w:rPr/>
+              <w:t>)</w:t>
               <w:br/>
-              <w:t>4. Zanidatamab plus tislelizumab and chemotherapy as first-line treatment for HER2-positive gastric/gastroesophageal junction adenocarcinoma: a phase Ib/II study. Clin Cancer Res. 2026;32(2). DOI 10.1158/1078-0432.CCR-24-4295</w:t>
+              <w:t>4. Zanidatamab plus tislelizumab and chemotherapy as first-line treatment for HER2-positive gastric/gastroesophageal junction adenocarcinoma: a phase Ib/II study. Clin Cancer Res. 2026;32(2). DOI 10.1158/1078-0432.CCR-24-4295(</w:t>
+            </w:r>
+            <w:r>
+              <w:rPr/>
+              <w:t>本科白禮源第二作者</w:t>
+            </w:r>
+            <w:r>
+              <w:rPr/>
+              <w:t>;</w:t>
+            </w:r>
+            <w:r>
+              <w:rPr/>
+              <w:t>國際多中心早期試驗</w:t>
+            </w:r>
+            <w:r>
+              <w:rPr/>
+              <w:t>)</w:t>
               <w:br/>
-              <w:t>5. Wang HT, et al. Intraperitoneal nivolumab for malignant ascites in patients with advanced gastrointestinal or pancreaticobiliary tract cancer. Int J Clin Oncol. 2026;31(2):281-291. DOI 10.1007/s10147-025-02930-y</w:t>
+              <w:t>5. Wang HT, et al. Intraperitoneal nivolumab for malignant ascites in patients with advanced gastrointestinal or pancreaticobiliary tract cancer. Int J Clin Oncol. 2026;31(2):281-291. DOI 10.1007/s10147-025-02930-y(</w:t>
+            </w:r>
+            <w:r>
+              <w:rPr/>
+              <w:t>本科王秀慈第一作者、白禮源通訊作者</w:t>
+            </w:r>
+            <w:r>
+              <w:rPr/>
+              <w:t>;</w:t>
+            </w:r>
+            <w:r>
+              <w:rPr/>
+              <w:t>林美辰、陳珈妤、邱昌芳合著</w:t>
+            </w:r>
+            <w:r>
+              <w:rPr/>
+              <w:t>)</w:t>
               <w:br/>
-              <w:t xml:space="preserve">6. Hsieh CY, et al. Rituximab plus gemcitabine and cisplatin in recurrent/metastatic head and neck squamous cell carcinoma: a phase I trial. BMC Cancer. 2022;22:169. DOI 10.1186/s12885-022-09258-0 </w:t>
+              <w:t>6. Hsieh CY, et al. Rituximab plus gemcitabine and cisplatin in recurrent/metastatic head and neck squamous cell carcinoma: a phase I trial. BMC Cancer. 2022;22:169. DOI 10.1186/s12885-022-09258-0(</w:t>
+            </w:r>
+            <w:r>
+              <w:rPr/>
+              <w:t>本科自主主導之第一期試驗</w:t>
+            </w:r>
+            <w:r>
+              <w:rPr/>
+              <w:t>;</w:t>
+            </w:r>
+            <w:r>
+              <w:rPr/>
+              <w:t>謝清昀第一作者、林精湛通訊作者</w:t>
+            </w:r>
+            <w:r>
+              <w:rPr/>
+              <w:t>;</w:t>
+            </w:r>
+            <w:r>
+              <w:rPr/>
+              <w:t>連銘渝、林振源、邱昌芳合著</w:t>
+            </w:r>
+            <w:r>
+              <w:rPr/>
+              <w:t xml:space="preserve">) </w:t>
             </w:r>
           </w:p>
         </w:tc>
@@ -1440,15 +1512,7 @@
             </w:r>
             <w:r>
               <w:rPr/>
-              <w:t>為全國首家通過涵蓋細胞與血液採集、檢測篩選、製備處理、儲存溫控與運送分發之全面性認證的醫學中心</w:t>
-            </w:r>
-            <w:r>
-              <w:rPr/>
-              <w:t>(</w:t>
-            </w:r>
-            <w:r>
-              <w:rPr/>
-              <w:t xml:space="preserve">本院 </w:t>
+              <w:t xml:space="preserve">為全國首家通過涵蓋細胞與血液採集、檢測篩選、製備處理、儲存溫控與運送分發之全面性認證的醫學中心。本院 </w:t>
             </w:r>
             <w:r>
               <w:rPr/>
@@ -1464,15 +1528,7 @@
             </w:r>
             <w:r>
               <w:rPr/>
-              <w:t>月公告</w:t>
-            </w:r>
-            <w:r>
-              <w:rPr/>
-              <w:t>)</w:t>
-            </w:r>
-            <w:r>
-              <w:rPr/>
-              <w:t>。</w:t>
+              <w:t>月公告稱「國內唯一通過國際認證之癌症免疫細胞治療機構」。</w:t>
             </w:r>
             <w:r>
               <w:rPr/>
@@ -1615,7 +1671,15 @@
             </w:r>
             <w:r>
               <w:rPr/>
-              <w:t>:</w:t>
+              <w:t>(</w:t>
+            </w:r>
+            <w:r>
+              <w:rPr/>
+              <w:t>財團法人生技醫療科技政策研究中心</w:t>
+            </w:r>
+            <w:r>
+              <w:rPr/>
+              <w:t>):</w:t>
             </w:r>
             <w:r>
               <w:rPr/>
@@ -1716,7 +1780,23 @@
             </w:r>
             <w:r>
               <w:rPr/>
-              <w:t>醫策會疾病照護品質認證</w:t>
+              <w:t>醫策會</w:t>
+            </w:r>
+            <w:r>
+              <w:rPr/>
+              <w:t>(</w:t>
+            </w:r>
+            <w:r>
+              <w:rPr/>
+              <w:t>財團法人醫院評鑑暨醫療品質策進會</w:t>
+            </w:r>
+            <w:r>
+              <w:rPr/>
+              <w:t>)</w:t>
+            </w:r>
+            <w:r>
+              <w:rPr/>
+              <w:t>疾病照護品質認證</w:t>
             </w:r>
             <w:r>
               <w:rPr/>
@@ -2270,7 +2350,7 @@
             </w:r>
             <w:r>
               <w:rPr/>
-              <w:t>諮詢與轉診</w:t>
+              <w:t>病情諮詢</w:t>
             </w:r>
             <w:r>
               <w:rPr/>
@@ -2278,7 +2358,31 @@
             </w:r>
             <w:r>
               <w:rPr/>
-              <w:t>依本院門診與轉診流程。</w:t>
+              <w:t>於門診與主治醫師討論。</w:t>
+            </w:r>
+            <w:r>
+              <w:rPr/>
+              <w:br/>
+            </w:r>
+            <w:r>
+              <w:rPr/>
+              <w:t>外院轉診與第二意見</w:t>
+            </w:r>
+            <w:r>
+              <w:rPr/>
+              <w:t>:</w:t>
+            </w:r>
+            <w:r>
+              <w:rPr/>
+              <w:t>依本院轉診中心流程</w:t>
+            </w:r>
+            <w:r>
+              <w:rPr/>
+              <w:t>,</w:t>
+            </w:r>
+            <w:r>
+              <w:rPr/>
+              <w:t>或直接預約血液腫瘤科門診。</w:t>
             </w:r>
           </w:p>
         </w:tc>
@@ -2316,6 +2420,74 @@
         </w:tc>
       </w:tr>
     </w:tbl>
+    <w:p>
+      <w:pPr>
+        <w:pStyle w:val="BodyTextfoot"/>
+        <w:bidi w:val="0"/>
+        <w:jc w:val="left"/>
+        <w:rPr/>
+      </w:pPr>
+      <w:r>
+        <w:rPr/>
+        <w:t xml:space="preserve">本頁資料截至 </w:t>
+      </w:r>
+      <w:r>
+        <w:rPr/>
+        <w:t xml:space="preserve">2026 </w:t>
+      </w:r>
+      <w:r>
+        <w:rPr/>
+        <w:t xml:space="preserve">年 </w:t>
+      </w:r>
+      <w:r>
+        <w:rPr/>
+        <w:t xml:space="preserve">10 </w:t>
+      </w:r>
+      <w:r>
+        <w:rPr/>
+        <w:t xml:space="preserve">月 </w:t>
+      </w:r>
+      <w:r>
+        <w:rPr/>
+        <w:t xml:space="preserve">20 </w:t>
+      </w:r>
+      <w:r>
+        <w:rPr/>
+        <w:t>日</w:t>
+      </w:r>
+      <w:r>
+        <w:rPr/>
+        <w:t>;</w:t>
+      </w:r>
+      <w:r>
+        <w:rPr/>
+        <w:t xml:space="preserve">院內統計於 </w:t>
+      </w:r>
+      <w:r>
+        <w:rPr/>
+        <w:t xml:space="preserve">2026 </w:t>
+      </w:r>
+      <w:r>
+        <w:rPr/>
+        <w:t xml:space="preserve">年 </w:t>
+      </w:r>
+      <w:r>
+        <w:rPr/>
+        <w:t xml:space="preserve">10 </w:t>
+      </w:r>
+      <w:r>
+        <w:rPr/>
+        <w:t xml:space="preserve">月 </w:t>
+      </w:r>
+      <w:r>
+        <w:rPr/>
+        <w:t xml:space="preserve">30 </w:t>
+      </w:r>
+      <w:r>
+        <w:rPr/>
+        <w:t>日第二次提交時更新。</w:t>
+      </w:r>
+    </w:p>
     <w:p>
       <w:pPr>
         <w:pStyle w:val="BodyTextfoot"/>

</xml_diff>

<commit_message>
block 4: transplant 2022–2026 (324) and CAR-T counts (13) from 郭晉廷; head-neck re-certification 2026/4–2029/3 (陳珈妤); English submission added
Co-Authored-By: Claude Fable 5.1 <noreply@anthropic.com>
</commit_message>
<xml_diff>
--- a/hemonc_feature_submission_20261021.docx
+++ b/hemonc_feature_submission_20261021.docx
@@ -540,11 +540,51 @@
             </w:pPr>
             <w:r>
               <w:rPr/>
-              <w:t xml:space="preserve">1. </w:t>
-            </w:r>
-            <w:r>
-              <w:rPr/>
-              <w:t xml:space="preserve">自 </w:t>
+              <w:t xml:space="preserve">1. 2022–2026 </w:t>
+            </w:r>
+            <w:r>
+              <w:rPr/>
+              <w:t xml:space="preserve">年造血幹細胞移植共 </w:t>
+            </w:r>
+            <w:r>
+              <w:rPr/>
+              <w:t xml:space="preserve">324 </w:t>
+            </w:r>
+            <w:r>
+              <w:rPr/>
+              <w:t>例</w:t>
+            </w:r>
+            <w:r>
+              <w:rPr/>
+              <w:t>(</w:t>
+            </w:r>
+            <w:r>
+              <w:rPr/>
+              <w:t xml:space="preserve">自體 </w:t>
+            </w:r>
+            <w:r>
+              <w:rPr/>
+              <w:t>131</w:t>
+            </w:r>
+            <w:r>
+              <w:rPr/>
+              <w:t xml:space="preserve">、異體 </w:t>
+            </w:r>
+            <w:r>
+              <w:rPr/>
+              <w:t xml:space="preserve">193):2022 </w:t>
+            </w:r>
+            <w:r>
+              <w:rPr/>
+              <w:t xml:space="preserve">年 </w:t>
+            </w:r>
+            <w:r>
+              <w:rPr/>
+              <w:t xml:space="preserve">71 </w:t>
+            </w:r>
+            <w:r>
+              <w:rPr/>
+              <w:t>例、</w:t>
             </w:r>
             <w:r>
               <w:rPr/>
@@ -556,35 +596,67 @@
             </w:r>
             <w:r>
               <w:rPr/>
-              <w:t xml:space="preserve">11 </w:t>
-            </w:r>
-            <w:r>
-              <w:rPr/>
-              <w:t xml:space="preserve">月起為中央健康保險署核准施行 </w:t>
-            </w:r>
-            <w:r>
-              <w:rPr/>
-              <w:t>CAR-T(Kymriah)</w:t>
-            </w:r>
-            <w:r>
-              <w:rPr/>
-              <w:t>細胞治療之醫院</w:t>
-            </w:r>
-            <w:r>
-              <w:rPr/>
-              <w:t>,</w:t>
-            </w:r>
-            <w:r>
-              <w:rPr/>
-              <w:t xml:space="preserve">治療急性淋巴性白血病與瀰漫性大 </w:t>
-            </w:r>
-            <w:r>
-              <w:rPr/>
-              <w:t xml:space="preserve">B </w:t>
-            </w:r>
-            <w:r>
-              <w:rPr/>
-              <w:t>細胞淋巴瘤。</w:t>
+              <w:t xml:space="preserve">71 </w:t>
+            </w:r>
+            <w:r>
+              <w:rPr/>
+              <w:t>例、</w:t>
+            </w:r>
+            <w:r>
+              <w:rPr/>
+              <w:t xml:space="preserve">2024 </w:t>
+            </w:r>
+            <w:r>
+              <w:rPr/>
+              <w:t xml:space="preserve">年 </w:t>
+            </w:r>
+            <w:r>
+              <w:rPr/>
+              <w:t xml:space="preserve">65 </w:t>
+            </w:r>
+            <w:r>
+              <w:rPr/>
+              <w:t>例、</w:t>
+            </w:r>
+            <w:r>
+              <w:rPr/>
+              <w:t xml:space="preserve">2025 </w:t>
+            </w:r>
+            <w:r>
+              <w:rPr/>
+              <w:t xml:space="preserve">年 </w:t>
+            </w:r>
+            <w:r>
+              <w:rPr/>
+              <w:t xml:space="preserve">61 </w:t>
+            </w:r>
+            <w:r>
+              <w:rPr/>
+              <w:t>例、</w:t>
+            </w:r>
+            <w:r>
+              <w:rPr/>
+              <w:t xml:space="preserve">2026 </w:t>
+            </w:r>
+            <w:r>
+              <w:rPr/>
+              <w:t xml:space="preserve">年截至 </w:t>
+            </w:r>
+            <w:r>
+              <w:rPr/>
+              <w:t xml:space="preserve">10 </w:t>
+            </w:r>
+            <w:r>
+              <w:rPr/>
+              <w:t xml:space="preserve">月 </w:t>
+            </w:r>
+            <w:r>
+              <w:rPr/>
+              <w:t xml:space="preserve">56 </w:t>
+            </w:r>
+            <w:r>
+              <w:rPr/>
+              <w:t>例。</w:t>
             </w:r>
             <w:r>
               <w:rPr/>
@@ -600,11 +672,11 @@
             </w:r>
             <w:r>
               <w:rPr/>
-              <w:t xml:space="preserve">健保署核准名單 </w:t>
-            </w:r>
-            <w:r>
-              <w:rPr/>
-              <w:t xml:space="preserve">2023 </w:t>
+              <w:t>本院移植團隊統計</w:t>
+            </w:r>
+            <w:r>
+              <w:rPr/>
+              <w:t xml:space="preserve">,2026 </w:t>
             </w:r>
             <w:r>
               <w:rPr/>
@@ -612,19 +684,19 @@
             </w:r>
             <w:r>
               <w:rPr/>
-              <w:t xml:space="preserve">11 </w:t>
-            </w:r>
-            <w:r>
-              <w:rPr/>
-              <w:t>月</w:t>
-            </w:r>
-            <w:r>
-              <w:rPr/>
-              <w:t>;</w:t>
-            </w:r>
-            <w:r>
-              <w:rPr/>
-              <w:t>本院新聞稿</w:t>
+              <w:t xml:space="preserve">10 </w:t>
+            </w:r>
+            <w:r>
+              <w:rPr/>
+              <w:t xml:space="preserve">月 </w:t>
+            </w:r>
+            <w:r>
+              <w:rPr/>
+              <w:t xml:space="preserve">21 </w:t>
+            </w:r>
+            <w:r>
+              <w:rPr/>
+              <w:t>日</w:t>
             </w:r>
             <w:r>
               <w:rPr/>
@@ -634,15 +706,79 @@
             </w:r>
             <w:r>
               <w:rPr/>
-              <w:t>細胞治療</w:t>
-            </w:r>
-            <w:r>
-              <w:rPr/>
-              <w:t xml:space="preserve">(CIK/DC-CIK </w:t>
-            </w:r>
-            <w:r>
-              <w:rPr/>
-              <w:t>等</w:t>
+              <w:t xml:space="preserve">自 </w:t>
+            </w:r>
+            <w:r>
+              <w:rPr/>
+              <w:t xml:space="preserve">2023 </w:t>
+            </w:r>
+            <w:r>
+              <w:rPr/>
+              <w:t xml:space="preserve">年 </w:t>
+            </w:r>
+            <w:r>
+              <w:rPr/>
+              <w:t xml:space="preserve">11 </w:t>
+            </w:r>
+            <w:r>
+              <w:rPr/>
+              <w:t xml:space="preserve">月起為中央健康保險署核准施行 </w:t>
+            </w:r>
+            <w:r>
+              <w:rPr/>
+              <w:t>CAR-T(Kymriah)</w:t>
+            </w:r>
+            <w:r>
+              <w:rPr/>
+              <w:t>細胞治療之醫院</w:t>
+            </w:r>
+            <w:r>
+              <w:rPr/>
+              <w:t>,</w:t>
+            </w:r>
+            <w:r>
+              <w:rPr/>
+              <w:t xml:space="preserve">治療急性淋巴性白血病與瀰漫性大 </w:t>
+            </w:r>
+            <w:r>
+              <w:rPr/>
+              <w:t xml:space="preserve">B </w:t>
+            </w:r>
+            <w:r>
+              <w:rPr/>
+              <w:t>細胞淋巴瘤</w:t>
+            </w:r>
+            <w:r>
+              <w:rPr/>
+              <w:t xml:space="preserve">;CAR-T </w:t>
+            </w:r>
+            <w:r>
+              <w:rPr/>
+              <w:t xml:space="preserve">治療個案 </w:t>
+            </w:r>
+            <w:r>
+              <w:rPr/>
+              <w:t xml:space="preserve">2023 </w:t>
+            </w:r>
+            <w:r>
+              <w:rPr/>
+              <w:t xml:space="preserve">年 </w:t>
+            </w:r>
+            <w:r>
+              <w:rPr/>
+              <w:t xml:space="preserve">1 </w:t>
+            </w:r>
+            <w:r>
+              <w:rPr/>
+              <w:t>例</w:t>
+            </w:r>
+            <w:r>
+              <w:rPr/>
+              <w:t>(</w:t>
+            </w:r>
+            <w:r>
+              <w:rPr/>
+              <w:t>自費</w:t>
             </w:r>
             <w:r>
               <w:rPr/>
@@ -650,7 +786,7 @@
             </w:r>
             <w:r>
               <w:rPr/>
-              <w:t xml:space="preserve">自特管辦法公布至 </w:t>
+              <w:t>、</w:t>
             </w:r>
             <w:r>
               <w:rPr/>
@@ -662,6 +798,94 @@
             </w:r>
             <w:r>
               <w:rPr/>
+              <w:t xml:space="preserve">2 </w:t>
+            </w:r>
+            <w:r>
+              <w:rPr/>
+              <w:t>例、</w:t>
+            </w:r>
+            <w:r>
+              <w:rPr/>
+              <w:t xml:space="preserve">2025 </w:t>
+            </w:r>
+            <w:r>
+              <w:rPr/>
+              <w:t xml:space="preserve">年 </w:t>
+            </w:r>
+            <w:r>
+              <w:rPr/>
+              <w:t xml:space="preserve">5 </w:t>
+            </w:r>
+            <w:r>
+              <w:rPr/>
+              <w:t>例、</w:t>
+            </w:r>
+            <w:r>
+              <w:rPr/>
+              <w:t xml:space="preserve">2026 </w:t>
+            </w:r>
+            <w:r>
+              <w:rPr/>
+              <w:t xml:space="preserve">年截至 </w:t>
+            </w:r>
+            <w:r>
+              <w:rPr/>
+              <w:t xml:space="preserve">10 </w:t>
+            </w:r>
+            <w:r>
+              <w:rPr/>
+              <w:t xml:space="preserve">月 </w:t>
+            </w:r>
+            <w:r>
+              <w:rPr/>
+              <w:t xml:space="preserve">5 </w:t>
+            </w:r>
+            <w:r>
+              <w:rPr/>
+              <w:t>例</w:t>
+            </w:r>
+            <w:r>
+              <w:rPr/>
+              <w:t>,</w:t>
+            </w:r>
+            <w:r>
+              <w:rPr/>
+              <w:t xml:space="preserve">累計 </w:t>
+            </w:r>
+            <w:r>
+              <w:rPr/>
+              <w:t xml:space="preserve">13 </w:t>
+            </w:r>
+            <w:r>
+              <w:rPr/>
+              <w:t>例。</w:t>
+            </w:r>
+            <w:r>
+              <w:rPr/>
+              <w:t>(</w:t>
+            </w:r>
+            <w:r>
+              <w:rPr/>
+              <w:t>來源</w:t>
+            </w:r>
+            <w:r>
+              <w:rPr/>
+              <w:t>:</w:t>
+            </w:r>
+            <w:r>
+              <w:rPr/>
+              <w:t xml:space="preserve">健保署核准名單 </w:t>
+            </w:r>
+            <w:r>
+              <w:rPr/>
+              <w:t xml:space="preserve">2023 </w:t>
+            </w:r>
+            <w:r>
+              <w:rPr/>
+              <w:t xml:space="preserve">年 </w:t>
+            </w:r>
+            <w:r>
+              <w:rPr/>
               <w:t xml:space="preserve">11 </w:t>
             </w:r>
             <w:r>
@@ -670,41 +894,115 @@
             </w:r>
             <w:r>
               <w:rPr/>
-              <w:t>,</w:t>
-            </w:r>
-            <w:r>
-              <w:rPr/>
-              <w:t xml:space="preserve">累計 </w:t>
-            </w:r>
-            <w:r>
-              <w:rPr/>
-              <w:t xml:space="preserve">783 </w:t>
-            </w:r>
-            <w:r>
-              <w:rPr/>
-              <w:t>人簽署同意接受治療。</w:t>
-            </w:r>
-            <w:r>
-              <w:rPr/>
-              <w:t>(</w:t>
-            </w:r>
-            <w:r>
-              <w:rPr/>
-              <w:t>來源</w:t>
-            </w:r>
-            <w:r>
-              <w:rPr/>
-              <w:t>:</w:t>
-            </w:r>
-            <w:r>
-              <w:rPr/>
-              <w:t>本院細胞治療中心</w:t>
+              <w:t>;</w:t>
+            </w:r>
+            <w:r>
+              <w:rPr/>
+              <w:t xml:space="preserve">本院個管統計 </w:t>
+            </w:r>
+            <w:r>
+              <w:rPr/>
+              <w:t xml:space="preserve">2026 </w:t>
+            </w:r>
+            <w:r>
+              <w:rPr/>
+              <w:t xml:space="preserve">年 </w:t>
+            </w:r>
+            <w:r>
+              <w:rPr/>
+              <w:t xml:space="preserve">10 </w:t>
+            </w:r>
+            <w:r>
+              <w:rPr/>
+              <w:t xml:space="preserve">月 </w:t>
+            </w:r>
+            <w:r>
+              <w:rPr/>
+              <w:t xml:space="preserve">21 </w:t>
+            </w:r>
+            <w:r>
+              <w:rPr/>
+              <w:t>日</w:t>
             </w:r>
             <w:r>
               <w:rPr/>
               <w:t>)</w:t>
               <w:br/>
-              <w:t xml:space="preserve">3. 2021–2026 </w:t>
+              <w:t xml:space="preserve">3. </w:t>
+            </w:r>
+            <w:r>
+              <w:rPr/>
+              <w:t>細胞治療</w:t>
+            </w:r>
+            <w:r>
+              <w:rPr/>
+              <w:t xml:space="preserve">(CIK/DC-CIK </w:t>
+            </w:r>
+            <w:r>
+              <w:rPr/>
+              <w:t>等</w:t>
+            </w:r>
+            <w:r>
+              <w:rPr/>
+              <w:t>)</w:t>
+            </w:r>
+            <w:r>
+              <w:rPr/>
+              <w:t xml:space="preserve">自特管辦法公布至 </w:t>
+            </w:r>
+            <w:r>
+              <w:rPr/>
+              <w:t xml:space="preserve">2024 </w:t>
+            </w:r>
+            <w:r>
+              <w:rPr/>
+              <w:t xml:space="preserve">年 </w:t>
+            </w:r>
+            <w:r>
+              <w:rPr/>
+              <w:t xml:space="preserve">11 </w:t>
+            </w:r>
+            <w:r>
+              <w:rPr/>
+              <w:t>月</w:t>
+            </w:r>
+            <w:r>
+              <w:rPr/>
+              <w:t>,</w:t>
+            </w:r>
+            <w:r>
+              <w:rPr/>
+              <w:t xml:space="preserve">累計 </w:t>
+            </w:r>
+            <w:r>
+              <w:rPr/>
+              <w:t xml:space="preserve">783 </w:t>
+            </w:r>
+            <w:r>
+              <w:rPr/>
+              <w:t>人簽署同意接受治療。</w:t>
+            </w:r>
+            <w:r>
+              <w:rPr/>
+              <w:t>(</w:t>
+            </w:r>
+            <w:r>
+              <w:rPr/>
+              <w:t>來源</w:t>
+            </w:r>
+            <w:r>
+              <w:rPr/>
+              <w:t>:</w:t>
+            </w:r>
+            <w:r>
+              <w:rPr/>
+              <w:t>本院細胞治療中心</w:t>
+            </w:r>
+            <w:r>
+              <w:rPr/>
+              <w:t>)</w:t>
+              <w:br/>
+              <w:t xml:space="preserve">4. 2021–2026 </w:t>
             </w:r>
             <w:r>
               <w:rPr/>
@@ -778,7 +1076,79 @@
               <w:rPr/>
               <w:t>:PubMed)</w:t>
               <w:br/>
-              <w:t xml:space="preserve">4. CAR001 </w:t>
+              <w:t xml:space="preserve">5. </w:t>
+            </w:r>
+            <w:r>
+              <w:rPr/>
+              <w:t>臨床試驗</w:t>
+            </w:r>
+            <w:r>
+              <w:rPr/>
+              <w:t>:</w:t>
+            </w:r>
+            <w:r>
+              <w:rPr/>
+              <w:t xml:space="preserve">本科進行中之臨床試驗計 </w:t>
+            </w:r>
+            <w:r>
+              <w:rPr/>
+              <w:t xml:space="preserve">57 </w:t>
+            </w:r>
+            <w:r>
+              <w:rPr/>
+              <w:t>件</w:t>
+            </w:r>
+            <w:r>
+              <w:rPr/>
+              <w:t xml:space="preserve">(2026 </w:t>
+            </w:r>
+            <w:r>
+              <w:rPr/>
+              <w:t xml:space="preserve">年 </w:t>
+            </w:r>
+            <w:r>
+              <w:rPr/>
+              <w:t xml:space="preserve">10 </w:t>
+            </w:r>
+            <w:r>
+              <w:rPr/>
+              <w:t xml:space="preserve">月 </w:t>
+            </w:r>
+            <w:r>
+              <w:rPr/>
+              <w:t xml:space="preserve">19 </w:t>
+            </w:r>
+            <w:r>
+              <w:rPr/>
+              <w:t>日統計</w:t>
+            </w:r>
+            <w:r>
+              <w:rPr/>
+              <w:t>;</w:t>
+            </w:r>
+            <w:r>
+              <w:rPr/>
+              <w:t>來源</w:t>
+            </w:r>
+            <w:r>
+              <w:rPr/>
+              <w:t>:</w:t>
+            </w:r>
+            <w:r>
+              <w:rPr/>
+              <w:t>本院臨床試驗中心</w:t>
+            </w:r>
+            <w:r>
+              <w:rPr/>
+              <w:t>)</w:t>
+            </w:r>
+            <w:r>
+              <w:rPr/>
+              <w:t xml:space="preserve">。其中 </w:t>
+            </w:r>
+            <w:r>
+              <w:rPr/>
+              <w:t xml:space="preserve">CAR001 </w:t>
             </w:r>
             <w:r>
               <w:rPr/>
@@ -935,64 +1305,6 @@
             <w:r>
               <w:rPr/>
               <w:t>日公開資訊</w:t>
-            </w:r>
-            <w:r>
-              <w:rPr/>
-              <w:t>)</w:t>
-              <w:br/>
-              <w:t xml:space="preserve">5. </w:t>
-            </w:r>
-            <w:r>
-              <w:rPr/>
-              <w:t xml:space="preserve">本科進行中之臨床試驗計 </w:t>
-            </w:r>
-            <w:r>
-              <w:rPr/>
-              <w:t xml:space="preserve">57 </w:t>
-            </w:r>
-            <w:r>
-              <w:rPr/>
-              <w:t>件。</w:t>
-            </w:r>
-            <w:r>
-              <w:rPr/>
-              <w:t>(</w:t>
-            </w:r>
-            <w:r>
-              <w:rPr/>
-              <w:t>來源</w:t>
-            </w:r>
-            <w:r>
-              <w:rPr/>
-              <w:t>:</w:t>
-            </w:r>
-            <w:r>
-              <w:rPr/>
-              <w:t>本院臨床試驗中心</w:t>
-            </w:r>
-            <w:r>
-              <w:rPr/>
-              <w:t xml:space="preserve">,2026 </w:t>
-            </w:r>
-            <w:r>
-              <w:rPr/>
-              <w:t xml:space="preserve">年 </w:t>
-            </w:r>
-            <w:r>
-              <w:rPr/>
-              <w:t xml:space="preserve">10 </w:t>
-            </w:r>
-            <w:r>
-              <w:rPr/>
-              <w:t xml:space="preserve">月 </w:t>
-            </w:r>
-            <w:r>
-              <w:rPr/>
-              <w:t xml:space="preserve">19 </w:t>
-            </w:r>
-            <w:r>
-              <w:rPr/>
-              <w:t>日統計</w:t>
             </w:r>
             <w:r>
               <w:rPr/>
@@ -1024,15 +1336,7 @@
             </w:r>
             <w:r>
               <w:rPr/>
-              <w:t>項。</w:t>
-            </w:r>
-            <w:r>
-              <w:rPr/>
-              <w:br/>
-            </w:r>
-            <w:r>
-              <w:rPr/>
-              <w:t xml:space="preserve">造血幹細胞移植年例數與一年整體存活率、每年 </w:t>
+              <w:t xml:space="preserve">項。移植例數與 </w:t>
             </w:r>
             <w:r>
               <w:rPr/>
@@ -1040,15 +1344,15 @@
             </w:r>
             <w:r>
               <w:rPr/>
-              <w:t>個案數之院內統計</w:t>
-            </w:r>
-            <w:r>
-              <w:rPr/>
-              <w:t>,</w:t>
-            </w:r>
-            <w:r>
-              <w:rPr/>
-              <w:t xml:space="preserve">於 </w:t>
+              <w:t xml:space="preserve">個案數為 </w:t>
+            </w:r>
+            <w:r>
+              <w:rPr/>
+              <w:t xml:space="preserve">2026 </w:t>
+            </w:r>
+            <w:r>
+              <w:rPr/>
+              <w:t xml:space="preserve">年 </w:t>
             </w:r>
             <w:r>
               <w:rPr/>
@@ -1060,11 +1364,11 @@
             </w:r>
             <w:r>
               <w:rPr/>
-              <w:t xml:space="preserve">30 </w:t>
-            </w:r>
-            <w:r>
-              <w:rPr/>
-              <w:t>日第二次提交補送</w:t>
+              <w:t xml:space="preserve">21 </w:t>
+            </w:r>
+            <w:r>
+              <w:rPr/>
+              <w:t>日院內統計</w:t>
             </w:r>
             <w:r>
               <w:rPr/>
@@ -1072,7 +1376,15 @@
             </w:r>
             <w:r>
               <w:rPr/>
-              <w:t>屆時擬將移植成效列為第一項。</w:t>
+              <w:t>一年存活率因無外部基準與分母定義</w:t>
+            </w:r>
+            <w:r>
+              <w:rPr/>
+              <w:t>,</w:t>
+            </w:r>
+            <w:r>
+              <w:rPr/>
+              <w:t>不列。</w:t>
             </w:r>
           </w:p>
         </w:tc>
@@ -1808,15 +2120,7 @@
             </w:r>
             <w:r>
               <w:rPr/>
-              <w:t>(</w:t>
-            </w:r>
-            <w:r>
-              <w:rPr/>
-              <w:t xml:space="preserve">認證期間 </w:t>
-            </w:r>
-            <w:r>
-              <w:rPr/>
-              <w:t xml:space="preserve">2023 </w:t>
+              <w:t xml:space="preserve">(2023 </w:t>
             </w:r>
             <w:r>
               <w:rPr/>
@@ -1833,6 +2137,54 @@
             <w:r>
               <w:rPr/>
               <w:t xml:space="preserve">2026 </w:t>
+            </w:r>
+            <w:r>
+              <w:rPr/>
+              <w:t xml:space="preserve">年 </w:t>
+            </w:r>
+            <w:r>
+              <w:rPr/>
+              <w:t xml:space="preserve">3 </w:t>
+            </w:r>
+            <w:r>
+              <w:rPr/>
+              <w:t>月</w:t>
+            </w:r>
+            <w:r>
+              <w:rPr/>
+              <w:t xml:space="preserve">,2026 </w:t>
+            </w:r>
+            <w:r>
+              <w:rPr/>
+              <w:t>年續認證通過</w:t>
+            </w:r>
+            <w:r>
+              <w:rPr/>
+              <w:t>,</w:t>
+            </w:r>
+            <w:r>
+              <w:rPr/>
+              <w:t xml:space="preserve">新效期 </w:t>
+            </w:r>
+            <w:r>
+              <w:rPr/>
+              <w:t xml:space="preserve">2026 </w:t>
+            </w:r>
+            <w:r>
+              <w:rPr/>
+              <w:t xml:space="preserve">年 </w:t>
+            </w:r>
+            <w:r>
+              <w:rPr/>
+              <w:t xml:space="preserve">4 </w:t>
+            </w:r>
+            <w:r>
+              <w:rPr/>
+              <w:t xml:space="preserve">月至 </w:t>
+            </w:r>
+            <w:r>
+              <w:rPr/>
+              <w:t xml:space="preserve">2029 </w:t>
             </w:r>
             <w:r>
               <w:rPr/>
@@ -1988,35 +2340,43 @@
             </w:r>
             <w:r>
               <w:rPr/>
-              <w:t>(</w:t>
-            </w:r>
-            <w:r>
-              <w:rPr/>
-              <w:t>本科官網「引領卓越」頁所載證書影像</w:t>
-            </w:r>
-            <w:r>
-              <w:rPr/>
-              <w:t>)</w:t>
-            </w:r>
-            <w:r>
-              <w:rPr/>
-              <w:t xml:space="preserve">。第 </w:t>
-            </w:r>
-            <w:r>
-              <w:rPr/>
-              <w:t xml:space="preserve">5 </w:t>
-            </w:r>
-            <w:r>
-              <w:rPr/>
-              <w:t>項兩項認證效期已屆滿</w:t>
-            </w:r>
-            <w:r>
-              <w:rPr/>
-              <w:t>,</w:t>
-            </w:r>
-            <w:r>
-              <w:rPr/>
-              <w:t>續認證結果確認後更新。</w:t>
+              <w:t>;</w:t>
+            </w:r>
+            <w:r>
+              <w:rPr/>
+              <w:t xml:space="preserve">頭頸癌續認證依頭頸癌團隊 </w:t>
+            </w:r>
+            <w:r>
+              <w:rPr/>
+              <w:t xml:space="preserve">2026 </w:t>
+            </w:r>
+            <w:r>
+              <w:rPr/>
+              <w:t xml:space="preserve">年 </w:t>
+            </w:r>
+            <w:r>
+              <w:rPr/>
+              <w:t xml:space="preserve">10 </w:t>
+            </w:r>
+            <w:r>
+              <w:rPr/>
+              <w:t xml:space="preserve">月 </w:t>
+            </w:r>
+            <w:r>
+              <w:rPr/>
+              <w:t xml:space="preserve">21 </w:t>
+            </w:r>
+            <w:r>
+              <w:rPr/>
+              <w:t>日回報</w:t>
+            </w:r>
+            <w:r>
+              <w:rPr/>
+              <w:t>;</w:t>
+            </w:r>
+            <w:r>
+              <w:rPr/>
+              <w:t>乳癌續認證確認後更新。</w:t>
             </w:r>
             <w:r>
               <w:rPr/>
@@ -2449,43 +2809,11 @@
       </w:r>
       <w:r>
         <w:rPr/>
-        <w:t xml:space="preserve">20 </w:t>
+        <w:t xml:space="preserve">21 </w:t>
       </w:r>
       <w:r>
         <w:rPr/>
-        <w:t>日</w:t>
-      </w:r>
-      <w:r>
-        <w:rPr/>
-        <w:t>;</w:t>
-      </w:r>
-      <w:r>
-        <w:rPr/>
-        <w:t xml:space="preserve">院內統計於 </w:t>
-      </w:r>
-      <w:r>
-        <w:rPr/>
-        <w:t xml:space="preserve">2026 </w:t>
-      </w:r>
-      <w:r>
-        <w:rPr/>
-        <w:t xml:space="preserve">年 </w:t>
-      </w:r>
-      <w:r>
-        <w:rPr/>
-        <w:t xml:space="preserve">10 </w:t>
-      </w:r>
-      <w:r>
-        <w:rPr/>
-        <w:t xml:space="preserve">月 </w:t>
-      </w:r>
-      <w:r>
-        <w:rPr/>
-        <w:t xml:space="preserve">30 </w:t>
-      </w:r>
-      <w:r>
-        <w:rPr/>
-        <w:t>日第二次提交時更新。</w:t>
+        <w:t>日。</w:t>
       </w:r>
     </w:p>
     <w:p>

</xml_diff>